<commit_message>
Precisar que los 167 expedientes (87/80) son expedientes nulos
Nueva marca sobre la definición de la muestra en Resultados; se ajustan
las marcas de las Tablas 3 y 5 y de Aportes, y en el informe las cifras
de referencia, las conclusiones sugeridas y la séptima recomendación.

Co-Authored-By: Claude Opus 5.5 <noreply@anthropic.com>
Claude-Session: https://claude.ai/code/session_01XFuYzN9DHY2Hj3pMHx8UWS
</commit_message>
<xml_diff>
--- a/MARCADO_APORTES_CONCLUSIONES_RECOMENDACIONES_JUAN_MESABEL_QUISPE_LEON.docx
+++ b/MARCADO_APORTES_CONCLUSIONES_RECOMENDACIONES_JUAN_MESABEL_QUISPE_LEON.docx
@@ -1599,7 +1599,7 @@
 
 <file path=word/comments.xml><?xml version="1.0" encoding="utf-8"?>
 <w:comments xmlns:a="http://schemas.openxmlformats.org/drawingml/2006/main" xmlns:pic="http://schemas.openxmlformats.org/drawingml/2006/picture" xmlns:r="http://schemas.openxmlformats.org/officeDocument/2006/relationships" xmlns:w="http://schemas.openxmlformats.org/wordprocessingml/2006/main" xmlns:wp="http://schemas.openxmlformats.org/drawingml/2006/wordprocessingDrawing" xmlns:mc="http://schemas.openxmlformats.org/markup-compatibility/2006" xmlns:a14="http://schemas.microsoft.com/office/drawing/2010/main" xmlns:w14="http://schemas.microsoft.com/office/word/2010/wordml" xmlns:wpc="http://schemas.microsoft.com/office/word/2010/wordprocessingCanvas">
-  <w:comment w:id="0" w:author="Revisión de coherencia" w:initials="RC" w:date="2026-09-29T11:41:08Z">
+  <w:comment w:id="0" w:author="Revisión de coherencia" w:initials="RC" w:date="2026-09-29T12:00:59Z">
     <w:p>
       <w:pPr>
         <w:pStyle w:val="CommentText"/>
@@ -1650,7 +1650,7 @@
       </w:r>
     </w:p>
   </w:comment>
-  <w:comment w:id="1" w:author="Revisión de coherencia" w:initials="RC" w:date="2026-09-29T11:41:08Z">
+  <w:comment w:id="1" w:author="Revisión de coherencia" w:initials="RC" w:date="2026-09-29T12:00:59Z">
     <w:p>
       <w:pPr>
         <w:pStyle w:val="CommentText"/>
@@ -1707,11 +1707,11 @@
         <w:t xml:space="preserve">Cambiar por: </w:t>
       </w:r>
       <w:r>
-        <w:t>«El análisis se practicó sobre ciento sesenta y siete (167) expedientes civiles con sentencia de primera instancia —ochenta y siete (87) del grupo Tradicional y ochenta (80) del grupo Oralidad—, sobre ciento sesenta y tres (163) sentencias de vista, de las cuales ciento cinco (105) declararon la nulidad (53 y 52), y sobre las series anuales de sentencias de segunda instancia de 2018 (281) y 2024 (328)».</w:t>
+        <w:t>«El análisis se practicó sobre ciento sesenta y siete (167) expedientes civiles nulos, cuya sentencia de primera instancia fue anulada por la Sala Civil —ochenta y siete (87) del grupo Tradicional y ochenta (80) del grupo Oralidad—, sobre ciento sesenta y tres (163) sentencias de vista, de las cuales ciento cinco (105) declararon la nulidad (53 y 52), y sobre las series anuales de sentencias de segunda instancia de 2018 (281) y 2024 (328)».</w:t>
       </w:r>
     </w:p>
   </w:comment>
-  <w:comment w:id="2" w:author="Revisión de coherencia" w:initials="RC" w:date="2026-09-29T11:41:08Z">
+  <w:comment w:id="2" w:author="Revisión de coherencia" w:initials="RC" w:date="2026-09-29T12:00:59Z">
     <w:p>
       <w:pPr>
         <w:pStyle w:val="CommentText"/>
@@ -1772,7 +1772,7 @@
       </w:r>
     </w:p>
   </w:comment>
-  <w:comment w:id="3" w:author="Revisión de coherencia" w:initials="RC" w:date="2026-09-29T11:41:08Z">
+  <w:comment w:id="3" w:author="Revisión de coherencia" w:initials="RC" w:date="2026-09-29T12:00:59Z">
     <w:p>
       <w:pPr>
         <w:pStyle w:val="CommentText"/>
@@ -1833,7 +1833,7 @@
       </w:r>
     </w:p>
   </w:comment>
-  <w:comment w:id="4" w:author="Revisión de coherencia" w:initials="RC" w:date="2026-09-29T11:41:08Z">
+  <w:comment w:id="4" w:author="Revisión de coherencia" w:initials="RC" w:date="2026-09-29T12:00:59Z">
     <w:p>
       <w:pPr>
         <w:pStyle w:val="CommentText"/>
@@ -1894,7 +1894,7 @@
       </w:r>
     </w:p>
   </w:comment>
-  <w:comment w:id="5" w:author="Revisión de coherencia" w:initials="RC" w:date="2026-09-29T11:41:08Z">
+  <w:comment w:id="5" w:author="Revisión de coherencia" w:initials="RC" w:date="2026-09-29T12:00:59Z">
     <w:p>
       <w:pPr>
         <w:pStyle w:val="CommentText"/>
@@ -1955,7 +1955,7 @@
       </w:r>
     </w:p>
   </w:comment>
-  <w:comment w:id="6" w:author="Revisión de coherencia" w:initials="RC" w:date="2026-09-29T11:41:08Z">
+  <w:comment w:id="6" w:author="Revisión de coherencia" w:initials="RC" w:date="2026-09-29T12:00:59Z">
     <w:p>
       <w:pPr>
         <w:pStyle w:val="CommentText"/>
@@ -2016,7 +2016,7 @@
       </w:r>
     </w:p>
   </w:comment>
-  <w:comment w:id="7" w:author="Revisión de coherencia" w:initials="RC" w:date="2026-09-29T11:41:08Z">
+  <w:comment w:id="7" w:author="Revisión de coherencia" w:initials="RC" w:date="2026-09-29T12:00:59Z">
     <w:p>
       <w:pPr>
         <w:pStyle w:val="CommentText"/>
@@ -2077,7 +2077,7 @@
       </w:r>
     </w:p>
   </w:comment>
-  <w:comment w:id="8" w:author="Revisión de coherencia" w:initials="RC" w:date="2026-09-29T11:41:08Z">
+  <w:comment w:id="8" w:author="Revisión de coherencia" w:initials="RC" w:date="2026-09-29T12:00:59Z">
     <w:p>
       <w:pPr>
         <w:pStyle w:val="CommentText"/>
@@ -2138,7 +2138,7 @@
       </w:r>
     </w:p>
   </w:comment>
-  <w:comment w:id="9" w:author="Revisión de coherencia" w:initials="RC" w:date="2026-09-29T11:41:08Z">
+  <w:comment w:id="9" w:author="Revisión de coherencia" w:initials="RC" w:date="2026-09-29T12:00:59Z">
     <w:p>
       <w:pPr>
         <w:pStyle w:val="CommentText"/>
@@ -2199,7 +2199,7 @@
       </w:r>
     </w:p>
   </w:comment>
-  <w:comment w:id="10" w:author="Revisión de coherencia" w:initials="RC" w:date="2026-09-29T11:41:08Z">
+  <w:comment w:id="10" w:author="Revisión de coherencia" w:initials="RC" w:date="2026-09-29T12:00:59Z">
     <w:p>
       <w:pPr>
         <w:pStyle w:val="CommentText"/>
@@ -2228,7 +2228,7 @@
         <w:t xml:space="preserve">Problema: </w:t>
       </w:r>
       <w:r>
-        <w:t>La duración del control superior no se presenta en el Cap. VI (R-11), y el «rasgo sistémico de las reformas latinoamericanas» contradice la Discusión.</w:t>
+        <w:t>La duración del control superior no se presenta en el Cap. VI (R-12), y el «rasgo sistémico de las reformas latinoamericanas» contradice la Discusión.</w:t>
       </w:r>
     </w:p>
     <w:p>
@@ -2260,7 +2260,7 @@
       </w:r>
     </w:p>
   </w:comment>
-  <w:comment w:id="11" w:author="Revisión de coherencia" w:initials="RC" w:date="2026-09-29T11:41:08Z">
+  <w:comment w:id="11" w:author="Revisión de coherencia" w:initials="RC" w:date="2026-09-29T12:00:59Z">
     <w:p>
       <w:pPr>
         <w:pStyle w:val="CommentText"/>
@@ -2321,7 +2321,7 @@
       </w:r>
     </w:p>
   </w:comment>
-  <w:comment w:id="12" w:author="Revisión de coherencia" w:initials="RC" w:date="2026-09-29T11:41:08Z">
+  <w:comment w:id="12" w:author="Revisión de coherencia" w:initials="RC" w:date="2026-09-29T12:00:59Z">
     <w:p>
       <w:pPr>
         <w:pStyle w:val="CommentText"/>
@@ -2382,7 +2382,7 @@
       </w:r>
     </w:p>
   </w:comment>
-  <w:comment w:id="13" w:author="Revisión de coherencia" w:initials="RC" w:date="2026-09-29T11:41:08Z">
+  <w:comment w:id="13" w:author="Revisión de coherencia" w:initials="RC" w:date="2026-09-29T12:00:59Z">
     <w:p>
       <w:pPr>
         <w:pStyle w:val="CommentText"/>
@@ -2439,11 +2439,11 @@
         <w:t xml:space="preserve">Cambiar por: </w:t>
       </w:r>
       <w:r>
-        <w:t>«El aporte empírico consiste en una medición sistemática, en el ámbito de la Sede Central de Arequipa, del efecto del Modelo de Oralidad Civil sobre el producto final del proceso, con base en 167 expedientes, 163 sentencias de vista (105 anuladas) y las series anuales de 2018 y 2024:»</w:t>
+        <w:t>«El aporte empírico consiste en una medición sistemática, en el ámbito de la Sede Central de Arequipa, del efecto del Modelo de Oralidad Civil sobre el producto final del proceso, con base en 167 expedientes nulos, 163 sentencias de vista (105 anuladas) y las series anuales de 2018 y 2024:»</w:t>
       </w:r>
     </w:p>
   </w:comment>
-  <w:comment w:id="14" w:author="Revisión de coherencia" w:initials="RC" w:date="2026-09-29T11:41:08Z">
+  <w:comment w:id="14" w:author="Revisión de coherencia" w:initials="RC" w:date="2026-09-29T12:00:59Z">
     <w:p>
       <w:pPr>
         <w:pStyle w:val="CommentText"/>
@@ -2472,7 +2472,7 @@
         <w:t xml:space="preserve">Problema: </w:t>
       </w:r>
       <w:r>
-        <w:t>97,1 % de censura y 48,8 % de anulación previa son cifras del corpus anterior. En la muestra actual la censura es casi total en ambos grupos (96,5 % y 97,4 %) porque los expedientes se seleccionaron por su hito de segunda instancia (Tabla 3), así que no es un resultado comparable.</w:t>
+        <w:t>97,1 % de censura y 48,8 % de anulación previa son cifras del corpus anterior. En la muestra actual la censura es casi total en ambos grupos (96,5 % y 97,4 %) porque todos los expedientes son nulos por definición de la muestra, así que no es un resultado comparable.</w:t>
       </w:r>
     </w:p>
     <w:p>
@@ -2504,7 +2504,7 @@
       </w:r>
     </w:p>
   </w:comment>
-  <w:comment w:id="15" w:author="Revisión de coherencia" w:initials="RC" w:date="2026-09-29T11:41:08Z">
+  <w:comment w:id="15" w:author="Revisión de coherencia" w:initials="RC" w:date="2026-09-29T12:00:59Z">
     <w:p>
       <w:pPr>
         <w:pStyle w:val="CommentText"/>
@@ -2565,7 +2565,7 @@
       </w:r>
     </w:p>
   </w:comment>
-  <w:comment w:id="16" w:author="Revisión de coherencia" w:initials="RC" w:date="2026-09-29T11:41:08Z">
+  <w:comment w:id="16" w:author="Revisión de coherencia" w:initials="RC" w:date="2026-09-29T12:00:59Z">
     <w:p>
       <w:pPr>
         <w:pStyle w:val="CommentText"/>
@@ -2626,7 +2626,7 @@
       </w:r>
     </w:p>
   </w:comment>
-  <w:comment w:id="17" w:author="Revisión de coherencia" w:initials="RC" w:date="2026-09-29T11:41:08Z">
+  <w:comment w:id="17" w:author="Revisión de coherencia" w:initials="RC" w:date="2026-09-29T12:00:59Z">
     <w:p>
       <w:pPr>
         <w:pStyle w:val="CommentText"/>
@@ -2687,7 +2687,7 @@
       </w:r>
     </w:p>
   </w:comment>
-  <w:comment w:id="18" w:author="Revisión de coherencia" w:initials="RC" w:date="2026-09-29T11:41:08Z">
+  <w:comment w:id="18" w:author="Revisión de coherencia" w:initials="RC" w:date="2026-09-29T12:00:59Z">
     <w:p>
       <w:pPr>
         <w:pStyle w:val="CommentText"/>
@@ -2748,7 +2748,7 @@
       </w:r>
     </w:p>
   </w:comment>
-  <w:comment w:id="19" w:author="Revisión de coherencia" w:initials="RC" w:date="2026-09-29T11:41:08Z">
+  <w:comment w:id="19" w:author="Revisión de coherencia" w:initials="RC" w:date="2026-09-29T12:00:59Z">
     <w:p>
       <w:pPr>
         <w:pStyle w:val="CommentText"/>
@@ -2809,7 +2809,7 @@
       </w:r>
     </w:p>
   </w:comment>
-  <w:comment w:id="20" w:author="Revisión de coherencia" w:initials="RC" w:date="2026-09-29T11:41:08Z">
+  <w:comment w:id="20" w:author="Revisión de coherencia" w:initials="RC" w:date="2026-09-29T12:00:59Z">
     <w:p>
       <w:pPr>
         <w:pStyle w:val="CommentText"/>
@@ -2870,7 +2870,7 @@
       </w:r>
     </w:p>
   </w:comment>
-  <w:comment w:id="21" w:author="Revisión de coherencia" w:initials="RC" w:date="2026-09-29T11:41:08Z">
+  <w:comment w:id="21" w:author="Revisión de coherencia" w:initials="RC" w:date="2026-09-29T12:00:59Z">
     <w:p>
       <w:pPr>
         <w:pStyle w:val="CommentText"/>
@@ -2931,7 +2931,7 @@
       </w:r>
     </w:p>
   </w:comment>
-  <w:comment w:id="22" w:author="Revisión de coherencia" w:initials="RC" w:date="2026-09-29T11:41:08Z">
+  <w:comment w:id="22" w:author="Revisión de coherencia" w:initials="RC" w:date="2026-09-29T12:00:59Z">
     <w:p>
       <w:pPr>
         <w:pStyle w:val="CommentText"/>
@@ -2992,7 +2992,7 @@
       </w:r>
     </w:p>
   </w:comment>
-  <w:comment w:id="23" w:author="Revisión de coherencia" w:initials="RC" w:date="2026-09-29T11:41:08Z">
+  <w:comment w:id="23" w:author="Revisión de coherencia" w:initials="RC" w:date="2026-09-29T12:00:59Z">
     <w:p>
       <w:pPr>
         <w:pStyle w:val="CommentText"/>
@@ -3053,7 +3053,7 @@
       </w:r>
     </w:p>
   </w:comment>
-  <w:comment w:id="24" w:author="Revisión de coherencia" w:initials="RC" w:date="2026-09-29T11:41:08Z">
+  <w:comment w:id="24" w:author="Revisión de coherencia" w:initials="RC" w:date="2026-09-29T12:00:59Z">
     <w:p>
       <w:pPr>
         <w:pStyle w:val="CommentText"/>
@@ -3114,7 +3114,7 @@
       </w:r>
     </w:p>
   </w:comment>
-  <w:comment w:id="25" w:author="Revisión de coherencia" w:initials="RC" w:date="2026-09-29T11:41:08Z">
+  <w:comment w:id="25" w:author="Revisión de coherencia" w:initials="RC" w:date="2026-09-29T12:00:59Z">
     <w:p>
       <w:pPr>
         <w:pStyle w:val="CommentText"/>
@@ -3175,7 +3175,7 @@
       </w:r>
     </w:p>
   </w:comment>
-  <w:comment w:id="26" w:author="Revisión de coherencia" w:initials="RC" w:date="2026-09-29T11:41:08Z">
+  <w:comment w:id="26" w:author="Revisión de coherencia" w:initials="RC" w:date="2026-09-29T12:00:59Z">
     <w:p>
       <w:pPr>
         <w:pStyle w:val="CommentText"/>
@@ -3236,7 +3236,7 @@
       </w:r>
     </w:p>
   </w:comment>
-  <w:comment w:id="27" w:author="Revisión de coherencia" w:initials="RC" w:date="2026-09-29T11:41:08Z">
+  <w:comment w:id="27" w:author="Revisión de coherencia" w:initials="RC" w:date="2026-09-29T12:00:59Z">
     <w:p>
       <w:pPr>
         <w:pStyle w:val="CommentText"/>
@@ -3297,7 +3297,7 @@
       </w:r>
     </w:p>
   </w:comment>
-  <w:comment w:id="28" w:author="Revisión de coherencia" w:initials="RC" w:date="2026-09-29T11:41:08Z">
+  <w:comment w:id="28" w:author="Revisión de coherencia" w:initials="RC" w:date="2026-09-29T12:00:59Z">
     <w:p>
       <w:pPr>
         <w:pStyle w:val="CommentText"/>
@@ -3358,7 +3358,7 @@
       </w:r>
     </w:p>
   </w:comment>
-  <w:comment w:id="29" w:author="Revisión de coherencia" w:initials="RC" w:date="2026-09-29T11:41:08Z">
+  <w:comment w:id="29" w:author="Revisión de coherencia" w:initials="RC" w:date="2026-09-29T12:00:59Z">
     <w:p>
       <w:pPr>
         <w:pStyle w:val="CommentText"/>
@@ -3401,7 +3401,7 @@
         <w:t xml:space="preserve">Contradice a: </w:t>
       </w:r>
       <w:r>
-        <w:t>Archivo RESULTADOS, 2.9 (R-15).</w:t>
+        <w:t>Archivo RESULTADOS, 2.9 (R-16).</w:t>
       </w:r>
     </w:p>
     <w:p>
@@ -3419,7 +3419,7 @@
       </w:r>
     </w:p>
   </w:comment>
-  <w:comment w:id="30" w:author="Revisión de coherencia" w:initials="RC" w:date="2026-09-29T11:41:08Z">
+  <w:comment w:id="30" w:author="Revisión de coherencia" w:initials="RC" w:date="2026-09-29T12:00:59Z">
     <w:p>
       <w:pPr>
         <w:pStyle w:val="CommentText"/>
@@ -3480,7 +3480,7 @@
       </w:r>
     </w:p>
   </w:comment>
-  <w:comment w:id="31" w:author="Revisión de coherencia" w:initials="RC" w:date="2026-09-29T11:41:08Z">
+  <w:comment w:id="31" w:author="Revisión de coherencia" w:initials="RC" w:date="2026-09-29T12:00:59Z">
     <w:p>
       <w:pPr>
         <w:pStyle w:val="CommentText"/>
@@ -3541,7 +3541,7 @@
       </w:r>
     </w:p>
   </w:comment>
-  <w:comment w:id="32" w:author="Revisión de coherencia" w:initials="RC" w:date="2026-09-29T11:41:08Z">
+  <w:comment w:id="32" w:author="Revisión de coherencia" w:initials="RC" w:date="2026-09-29T12:00:59Z">
     <w:p>
       <w:pPr>
         <w:pStyle w:val="CommentText"/>
@@ -3602,7 +3602,7 @@
       </w:r>
     </w:p>
   </w:comment>
-  <w:comment w:id="33" w:author="Revisión de coherencia" w:initials="RC" w:date="2026-09-29T11:41:08Z">
+  <w:comment w:id="33" w:author="Revisión de coherencia" w:initials="RC" w:date="2026-09-29T12:00:59Z">
     <w:p>
       <w:pPr>
         <w:pStyle w:val="CommentText"/>
@@ -3663,7 +3663,7 @@
       </w:r>
     </w:p>
   </w:comment>
-  <w:comment w:id="34" w:author="Revisión de coherencia" w:initials="RC" w:date="2026-09-29T11:41:08Z">
+  <w:comment w:id="34" w:author="Revisión de coherencia" w:initials="RC" w:date="2026-09-29T12:00:59Z">
     <w:p>
       <w:pPr>
         <w:pStyle w:val="CommentText"/>
@@ -3724,7 +3724,7 @@
       </w:r>
     </w:p>
   </w:comment>
-  <w:comment w:id="35" w:author="Revisión de coherencia" w:initials="RC" w:date="2026-09-29T11:41:08Z">
+  <w:comment w:id="35" w:author="Revisión de coherencia" w:initials="RC" w:date="2026-09-29T12:00:59Z">
     <w:p>
       <w:pPr>
         <w:pStyle w:val="CommentText"/>
@@ -3785,7 +3785,7 @@
       </w:r>
     </w:p>
   </w:comment>
-  <w:comment w:id="36" w:author="Revisión de coherencia" w:initials="RC" w:date="2026-09-29T11:41:08Z">
+  <w:comment w:id="36" w:author="Revisión de coherencia" w:initials="RC" w:date="2026-09-29T12:00:59Z">
     <w:p>
       <w:pPr>
         <w:pStyle w:val="CommentText"/>
@@ -3846,7 +3846,7 @@
       </w:r>
     </w:p>
   </w:comment>
-  <w:comment w:id="37" w:author="Revisión de coherencia" w:initials="RC" w:date="2026-09-29T11:41:08Z">
+  <w:comment w:id="37" w:author="Revisión de coherencia" w:initials="RC" w:date="2026-09-29T12:00:59Z">
     <w:p>
       <w:pPr>
         <w:pStyle w:val="CommentText"/>
@@ -3907,7 +3907,7 @@
       </w:r>
     </w:p>
   </w:comment>
-  <w:comment w:id="38" w:author="Revisión de coherencia" w:initials="RC" w:date="2026-09-29T11:41:08Z">
+  <w:comment w:id="38" w:author="Revisión de coherencia" w:initials="RC" w:date="2026-09-29T12:00:59Z">
     <w:p>
       <w:pPr>
         <w:pStyle w:val="CommentText"/>

</xml_diff>

<commit_message>
Revisión sobre las versiones nuevas: mapa de bases (n) y marcas actualizadas
RESULTADOS ya no incluye el Cap. VII; se eliminan sus marcas y se
reescriben las remisiones que lo citaban. Se agregan marcas sobre las
bases n (Tablas 1 y 2, definición de la muestra y bloque 281/328 de la
Tabla 6 de la Discusión) y, en el informe, un mapa de qué n corresponde
a cada tabla y dónde se mezclan.

Co-Authored-By: Claude Opus 5.5 <noreply@anthropic.com>
Claude-Session: https://claude.ai/code/session_01XFuYzN9DHY2Hj3pMHx8UWS
</commit_message>
<xml_diff>
--- a/MARCADO_APORTES_CONCLUSIONES_RECOMENDACIONES_JUAN_MESABEL_QUISPE_LEON.docx
+++ b/MARCADO_APORTES_CONCLUSIONES_RECOMENDACIONES_JUAN_MESABEL_QUISPE_LEON.docx
@@ -1599,7 +1599,7 @@
 
 <file path=word/comments.xml><?xml version="1.0" encoding="utf-8"?>
 <w:comments xmlns:a="http://schemas.openxmlformats.org/drawingml/2006/main" xmlns:pic="http://schemas.openxmlformats.org/drawingml/2006/picture" xmlns:r="http://schemas.openxmlformats.org/officeDocument/2006/relationships" xmlns:w="http://schemas.openxmlformats.org/wordprocessingml/2006/main" xmlns:wp="http://schemas.openxmlformats.org/drawingml/2006/wordprocessingDrawing" xmlns:mc="http://schemas.openxmlformats.org/markup-compatibility/2006" xmlns:a14="http://schemas.microsoft.com/office/drawing/2010/main" xmlns:w14="http://schemas.microsoft.com/office/word/2010/wordml" xmlns:wpc="http://schemas.microsoft.com/office/word/2010/wordprocessingCanvas">
-  <w:comment w:id="0" w:author="Revisión de coherencia" w:initials="RC" w:date="2026-09-29T12:52:43Z">
+  <w:comment w:id="0" w:author="Revisión de coherencia" w:initials="RC" w:date="2026-09-30T22:28:07Z">
     <w:p>
       <w:pPr>
         <w:pStyle w:val="CommentText"/>
@@ -1650,7 +1650,7 @@
       </w:r>
     </w:p>
   </w:comment>
-  <w:comment w:id="1" w:author="Revisión de coherencia" w:initials="RC" w:date="2026-09-29T12:52:43Z">
+  <w:comment w:id="1" w:author="Revisión de coherencia" w:initials="RC" w:date="2026-09-30T22:28:07Z">
     <w:p>
       <w:pPr>
         <w:pStyle w:val="CommentText"/>
@@ -1707,11 +1707,11 @@
         <w:t xml:space="preserve">Cambiar por: </w:t>
       </w:r>
       <w:r>
-        <w:t>«El análisis se practicó sobre ciento sesenta y siete (167) expedientes civiles cuya sentencia de primera instancia fue anulada o revocada en segunda instancia —ochenta y siete (87) del grupo Tradicional y ochenta (80) del grupo Oralidad—, sobre ciento sesenta y tres (163) sentencias de vista, de las cuales ciento cinco (105) declararon la nulidad (53 y 52), y sobre las series anuales de sentencias de segunda instancia de 2018 (281) y 2024 (328)».</w:t>
+        <w:t>«El análisis se practicó sobre ciento sesenta y siete (167) expedientes civiles cuya sentencia de primera instancia fue anulada o revocada en segunda instancia —ochenta y siete (87) del grupo Tradicional y ochenta (80) del grupo Oralidad—, sobre ciento sesenta y tres (163) sentencias de vista (85 y 78), de las cuales ciento cinco (105) declararon la nulidad (53 y 52), y sobre las series anuales de sentencias de segunda instancia de 2018 (281) y 2024 (328)».</w:t>
       </w:r>
     </w:p>
   </w:comment>
-  <w:comment w:id="2" w:author="Revisión de coherencia" w:initials="RC" w:date="2026-09-29T12:52:43Z">
+  <w:comment w:id="2" w:author="Revisión de coherencia" w:initials="RC" w:date="2026-09-30T22:28:07Z">
     <w:p>
       <w:pPr>
         <w:pStyle w:val="CommentText"/>
@@ -1754,7 +1754,7 @@
         <w:t xml:space="preserve">Contradice a: </w:t>
       </w:r>
       <w:r>
-        <w:t>Cap. VI, Tabla 3 («comparaciones descriptivas y no ajustadas por vía») y Cap. VII, 2.8 («no garantiza equivalencia entre grupos ni elimina factores de confusión»).</w:t>
+        <w:t>Cap. VI, Tabla 3 y párrafo posterior: el grupo Oralidad tiene más abreviados y «las comparaciones se leen como descriptivas y no ajustadas por vía».</w:t>
       </w:r>
     </w:p>
     <w:p>
@@ -1772,7 +1772,7 @@
       </w:r>
     </w:p>
   </w:comment>
-  <w:comment w:id="3" w:author="Revisión de coherencia" w:initials="RC" w:date="2026-09-29T12:52:43Z">
+  <w:comment w:id="3" w:author="Revisión de coherencia" w:initials="RC" w:date="2026-09-30T22:28:07Z">
     <w:p>
       <w:pPr>
         <w:pStyle w:val="CommentText"/>
@@ -1815,7 +1815,7 @@
         <w:t xml:space="preserve">Contradice a: </w:t>
       </w:r>
       <w:r>
-        <w:t>Cap. VII, 2.1 y 2.4 (RESULTADOS): «no bastan para imputar falta de colaboración a los abogados».</w:t>
+        <w:t>Cap. VI, 1.3 (convenciones): «Su frecuencia debe interpretarse según las posibilidades de acuerdo y las particularidades de cada caso».</w:t>
       </w:r>
     </w:p>
     <w:p>
@@ -1833,7 +1833,7 @@
       </w:r>
     </w:p>
   </w:comment>
-  <w:comment w:id="4" w:author="Revisión de coherencia" w:initials="RC" w:date="2026-09-29T12:52:43Z">
+  <w:comment w:id="4" w:author="Revisión de coherencia" w:initials="RC" w:date="2026-09-30T22:28:07Z">
     <w:p>
       <w:pPr>
         <w:pStyle w:val="CommentText"/>
@@ -1894,7 +1894,7 @@
       </w:r>
     </w:p>
   </w:comment>
-  <w:comment w:id="5" w:author="Revisión de coherencia" w:initials="RC" w:date="2026-09-29T12:52:43Z">
+  <w:comment w:id="5" w:author="Revisión de coherencia" w:initials="RC" w:date="2026-09-30T22:28:07Z">
     <w:p>
       <w:pPr>
         <w:pStyle w:val="CommentText"/>
@@ -1923,7 +1923,7 @@
         <w:t xml:space="preserve">Problema: </w:t>
       </w:r>
       <w:r>
-        <w:t>(i) Confirmación 2,9 % → 60,0 % y censura 97,1 % → 40,0 % no corresponden a la Tabla 5 actual (confirmada 1,2 % y 1,3 %). (ii) La serie «63,1 % → 80,3 %, p = 0,002 (Tabla 13)» no existe: las series son 65,5 % → 72,6 % (Tablas 1 y 2) y el Cap. VII declara que no hay contraste de significancia (con estas cifras, una prueba χ² daría p ≈ 0,06 para la confirmación). (iii) La lista de defectos incluye una categoría no codificada (omisión de regla vinculante), una sin variación (prueba de oficio: 1,9 % y 1,9 %) y la motivación aparente, que se mantiene estable (9,4 % y 9,6 %).</w:t>
+        <w:t>(i) Confirmación 2,9 % → 60,0 % y censura 97,1 % → 40,0 % no corresponden a la Tabla 5 actual (n = 85/78: confirmada 1,2 % y 1,3 %). (ii) La serie «63,1 % → 80,3 %, p = 0,002 (Tabla 13)» no existe: las series son 65,5 % → 72,6 % (Tablas 1 y 2, n = 281/328) y el Cap. VI solo presenta frecuencias descriptivas (con estas cifras, una prueba χ² daría p ≈ 0,06). (iii) La lista de defectos incluye una categoría no codificada (omisión de regla vinculante), una sin variación (prueba de oficio: 1,9 % y 1,9 %) y la motivación aparente, que se mantiene estable (9,4 % y 9,6 %).</w:t>
       </w:r>
     </w:p>
     <w:p>
@@ -1937,7 +1937,7 @@
         <w:t xml:space="preserve">Contradice a: </w:t>
       </w:r>
       <w:r>
-        <w:t>Cap. VI, Tablas 1, 2, 5 y 6; Cap. VII, 2.7.</w:t>
+        <w:t>Cap. VI, Tablas 1, 2, 5 y 6.</w:t>
       </w:r>
     </w:p>
     <w:p>
@@ -1955,7 +1955,7 @@
       </w:r>
     </w:p>
   </w:comment>
-  <w:comment w:id="6" w:author="Revisión de coherencia" w:initials="RC" w:date="2026-09-29T12:52:43Z">
+  <w:comment w:id="6" w:author="Revisión de coherencia" w:initials="RC" w:date="2026-09-30T22:28:07Z">
     <w:p>
       <w:pPr>
         <w:pStyle w:val="CommentText"/>
@@ -1984,7 +1984,7 @@
         <w:t xml:space="preserve">Problema: </w:t>
       </w:r>
       <w:r>
-        <w:t>Presenta como «vacío jurídico» algo que la Discusión califica como problema de registro y de gestión.</w:t>
+        <w:t>Presenta como «vacío jurídico» una brecha que los propios textos atribuyen a la gestión y al registro de la audiencia; el Cap. VI no contiene ningún dato sobre insuficiencia normativa.</w:t>
       </w:r>
     </w:p>
     <w:p>
@@ -1998,7 +1998,7 @@
         <w:t xml:space="preserve">Contradice a: </w:t>
       </w:r>
       <w:r>
-        <w:t>Cap. VII, 2.5 (RESULTADOS): «sustenta una propuesta de mejorar el registro y la conducción de la audiencia. No demuestra un vacío legislativo»; «La frecuencia reducida de un registro no permite concluir que deba incorporarse una nueva disposición al Código Procesal Civil».</w:t>
+        <w:t>DISCUSIÓN 5.2.2 («la variable crítica no es la norma sino el protocolo de audiencia y su supervisión») y este mismo archivo, § 4 («en la gestión del despacho y no en el texto legal»).</w:t>
       </w:r>
     </w:p>
     <w:p>
@@ -2016,7 +2016,7 @@
       </w:r>
     </w:p>
   </w:comment>
-  <w:comment w:id="7" w:author="Revisión de coherencia" w:initials="RC" w:date="2026-09-29T12:52:43Z">
+  <w:comment w:id="7" w:author="Revisión de coherencia" w:initials="RC" w:date="2026-09-30T22:28:07Z">
     <w:p>
       <w:pPr>
         <w:pStyle w:val="CommentText"/>
@@ -2059,7 +2059,7 @@
         <w:t xml:space="preserve">Contradice a: </w:t>
       </w:r>
       <w:r>
-        <w:t>Cap. VII, 2.5 (RESULTADOS): «La ausencia de cita expresa de las resoluciones administrativas en una sentencia no acredita, por sí misma, incumplimiento del modelo ni falta de control impugnatorio».</w:t>
+        <w:t>Cap. VI: no hay ningún indicador sobre la invocación de las R. A. en las sentencias.</w:t>
       </w:r>
     </w:p>
     <w:p>
@@ -2077,7 +2077,7 @@
       </w:r>
     </w:p>
   </w:comment>
-  <w:comment w:id="8" w:author="Revisión de coherencia" w:initials="RC" w:date="2026-09-29T12:52:43Z">
+  <w:comment w:id="8" w:author="Revisión de coherencia" w:initials="RC" w:date="2026-09-30T22:28:07Z">
     <w:p>
       <w:pPr>
         <w:pStyle w:val="CommentText"/>
@@ -2138,7 +2138,7 @@
       </w:r>
     </w:p>
   </w:comment>
-  <w:comment w:id="9" w:author="Revisión de coherencia" w:initials="RC" w:date="2026-09-29T12:52:43Z">
+  <w:comment w:id="9" w:author="Revisión de coherencia" w:initials="RC" w:date="2026-09-30T22:28:07Z">
     <w:p>
       <w:pPr>
         <w:pStyle w:val="CommentText"/>
@@ -2181,7 +2181,7 @@
         <w:t xml:space="preserve">Contradice a: </w:t>
       </w:r>
       <w:r>
-        <w:t>Tabla 6 y Cap. VII, 2.3 («de la incongruencia… hacia la motivación insuficiente»).</w:t>
+        <w:t>Tabla 6 (n = 53 / 52): c) 5,7 % → 11,5 %; e) 32,1 % → 25,0 %; d) 15,1 % → 28,8 %.</w:t>
       </w:r>
     </w:p>
     <w:p>
@@ -2199,7 +2199,7 @@
       </w:r>
     </w:p>
   </w:comment>
-  <w:comment w:id="10" w:author="Revisión de coherencia" w:initials="RC" w:date="2026-09-29T12:52:43Z">
+  <w:comment w:id="10" w:author="Revisión de coherencia" w:initials="RC" w:date="2026-09-30T22:28:07Z">
     <w:p>
       <w:pPr>
         <w:pStyle w:val="CommentText"/>
@@ -2228,7 +2228,7 @@
         <w:t xml:space="preserve">Problema: </w:t>
       </w:r>
       <w:r>
-        <w:t>La duración del control superior no se presenta en el Cap. VI (R-12), y el «rasgo sistémico de las reformas latinoamericanas» contradice la Discusión.</w:t>
+        <w:t>La duración del control superior no figura en ninguna tabla del Cap. VI, y el «rasgo sistémico de las reformas latinoamericanas» es una atribución causal que los datos no permiten.</w:t>
       </w:r>
     </w:p>
     <w:p>
@@ -2242,7 +2242,7 @@
         <w:t xml:space="preserve">Contradice a: </w:t>
       </w:r>
       <w:r>
-        <w:t>Cap. VII, 2.4 y 2.5 (RESULTADOS): «el contraste entre ordenamientos es contextual y no acredita una causa común de demora»; «No permite… identificarla como principal origen de la demora sin desagregar los tiempos».</w:t>
+        <w:t>Cap. VI, que no presenta ningún dato de duración, y 1.3: el diseño no permite «afirmar una reducción general de la duración procesal»; la reducción de tiempos solo constituye un «indicio».</w:t>
       </w:r>
     </w:p>
     <w:p>
@@ -2260,7 +2260,7 @@
       </w:r>
     </w:p>
   </w:comment>
-  <w:comment w:id="11" w:author="Revisión de coherencia" w:initials="RC" w:date="2026-09-29T12:52:43Z">
+  <w:comment w:id="11" w:author="Revisión de coherencia" w:initials="RC" w:date="2026-09-30T22:28:07Z">
     <w:p>
       <w:pPr>
         <w:pStyle w:val="CommentText"/>
@@ -2303,7 +2303,7 @@
         <w:t xml:space="preserve">Contradice a: </w:t>
       </w:r>
       <w:r>
-        <w:t>Tabla 4 (20,7 % → 71,3 %); Cap. VI, 1.1; Cap. VII, 2.5.</w:t>
+        <w:t>Tabla 4 (20,7 % → 71,3 %); Cap. VI, 1.1 (último párrafo: la comparación documental «no permite atribuir causalidad exclusiva a las resoluciones administrativas») y 1.3 (primer párrafo: «el diseño no permite atribuir exclusivamente al modelo estas diferencias»).</w:t>
       </w:r>
     </w:p>
     <w:p>
@@ -2321,7 +2321,7 @@
       </w:r>
     </w:p>
   </w:comment>
-  <w:comment w:id="12" w:author="Revisión de coherencia" w:initials="RC" w:date="2026-09-29T12:52:43Z">
+  <w:comment w:id="12" w:author="Revisión de coherencia" w:initials="RC" w:date="2026-09-30T22:28:07Z">
     <w:p>
       <w:pPr>
         <w:pStyle w:val="CommentText"/>
@@ -2382,7 +2382,7 @@
       </w:r>
     </w:p>
   </w:comment>
-  <w:comment w:id="13" w:author="Revisión de coherencia" w:initials="RC" w:date="2026-09-29T12:52:43Z">
+  <w:comment w:id="13" w:author="Revisión de coherencia" w:initials="RC" w:date="2026-09-30T22:28:07Z">
     <w:p>
       <w:pPr>
         <w:pStyle w:val="CommentText"/>
@@ -2425,7 +2425,7 @@
         <w:t xml:space="preserve">Contradice a: </w:t>
       </w:r>
       <w:r>
-        <w:t>Cap. VII, 2.8 (RESULTADOS): «no acredita que sea la primera utilización civil de la tipología ni que no existan estudios anteriores en Arequipa».</w:t>
+        <w:t>Cap. VI (167 expedientes, 163 sentencias de vista, 105 anuladas). Afirmar que es la «primera medición» exige acreditar que no hay estudios previos en Arequipa.</w:t>
       </w:r>
     </w:p>
     <w:p>
@@ -2443,7 +2443,7 @@
       </w:r>
     </w:p>
   </w:comment>
-  <w:comment w:id="14" w:author="Revisión de coherencia" w:initials="RC" w:date="2026-09-29T12:52:43Z">
+  <w:comment w:id="14" w:author="Revisión de coherencia" w:initials="RC" w:date="2026-09-30T22:28:07Z">
     <w:p>
       <w:pPr>
         <w:pStyle w:val="CommentText"/>
@@ -2504,7 +2504,7 @@
       </w:r>
     </w:p>
   </w:comment>
-  <w:comment w:id="15" w:author="Revisión de coherencia" w:initials="RC" w:date="2026-09-29T12:52:43Z">
+  <w:comment w:id="15" w:author="Revisión de coherencia" w:initials="RC" w:date="2026-09-30T22:28:07Z">
     <w:p>
       <w:pPr>
         <w:pStyle w:val="CommentText"/>
@@ -2565,7 +2565,7 @@
       </w:r>
     </w:p>
   </w:comment>
-  <w:comment w:id="16" w:author="Revisión de coherencia" w:initials="RC" w:date="2026-09-29T12:52:43Z">
+  <w:comment w:id="16" w:author="Revisión de coherencia" w:initials="RC" w:date="2026-09-30T22:28:07Z">
     <w:p>
       <w:pPr>
         <w:pStyle w:val="CommentText"/>
@@ -2626,7 +2626,7 @@
       </w:r>
     </w:p>
   </w:comment>
-  <w:comment w:id="17" w:author="Revisión de coherencia" w:initials="RC" w:date="2026-09-29T12:52:43Z">
+  <w:comment w:id="17" w:author="Revisión de coherencia" w:initials="RC" w:date="2026-09-30T22:28:07Z">
     <w:p>
       <w:pPr>
         <w:pStyle w:val="CommentText"/>
@@ -2687,7 +2687,7 @@
       </w:r>
     </w:p>
   </w:comment>
-  <w:comment w:id="18" w:author="Revisión de coherencia" w:initials="RC" w:date="2026-09-29T12:52:43Z">
+  <w:comment w:id="18" w:author="Revisión de coherencia" w:initials="RC" w:date="2026-09-30T22:28:07Z">
     <w:p>
       <w:pPr>
         <w:pStyle w:val="CommentText"/>
@@ -2748,7 +2748,7 @@
       </w:r>
     </w:p>
   </w:comment>
-  <w:comment w:id="19" w:author="Revisión de coherencia" w:initials="RC" w:date="2026-09-29T12:52:43Z">
+  <w:comment w:id="19" w:author="Revisión de coherencia" w:initials="RC" w:date="2026-09-30T22:28:07Z">
     <w:p>
       <w:pPr>
         <w:pStyle w:val="CommentText"/>
@@ -2791,7 +2791,7 @@
         <w:t xml:space="preserve">Contradice a: </w:t>
       </w:r>
       <w:r>
-        <w:t>Cap. VII, 2.6 («la información agregada no demuestra ese efecto») y 2.5 (RESULTADOS).</w:t>
+        <w:t>Cap. VI, que no presenta ningún dato de duración, y 1.3: el diseño no permite «afirmar una reducción general de la duración procesal»; la reducción de tiempos solo constituye un «indicio».</w:t>
       </w:r>
     </w:p>
     <w:p>
@@ -2809,7 +2809,7 @@
       </w:r>
     </w:p>
   </w:comment>
-  <w:comment w:id="20" w:author="Revisión de coherencia" w:initials="RC" w:date="2026-09-29T12:52:43Z">
+  <w:comment w:id="20" w:author="Revisión de coherencia" w:initials="RC" w:date="2026-09-30T22:28:07Z">
     <w:p>
       <w:pPr>
         <w:pStyle w:val="CommentText"/>
@@ -2852,7 +2852,7 @@
         <w:t xml:space="preserve">Contradice a: </w:t>
       </w:r>
       <w:r>
-        <w:t>Tabla 6 y Cap. VII, 2.2: «debe distinguir una categoría no identificada de una ausencia demostrada del defecto».</w:t>
+        <w:t>Tabla 6: f) figura con «—» y g) registra 10 y 9 resoluciones residuales.</w:t>
       </w:r>
     </w:p>
     <w:p>
@@ -2870,7 +2870,7 @@
       </w:r>
     </w:p>
   </w:comment>
-  <w:comment w:id="21" w:author="Revisión de coherencia" w:initials="RC" w:date="2026-09-29T12:52:43Z">
+  <w:comment w:id="21" w:author="Revisión de coherencia" w:initials="RC" w:date="2026-09-30T22:28:07Z">
     <w:p>
       <w:pPr>
         <w:pStyle w:val="CommentText"/>
@@ -2913,7 +2913,7 @@
         <w:t xml:space="preserve">Contradice a: </w:t>
       </w:r>
       <w:r>
-        <w:t>Cap. VII, 2.5 (RESULTADOS): «La mera mención de un pleno no demuestra su aplicación correcta».</w:t>
+        <w:t>Tabla 6: no incluye la causal «omisión de regla vinculante»; no se midió la aplicación de Plenos.</w:t>
       </w:r>
     </w:p>
     <w:p>
@@ -2931,7 +2931,7 @@
       </w:r>
     </w:p>
   </w:comment>
-  <w:comment w:id="22" w:author="Revisión de coherencia" w:initials="RC" w:date="2026-09-29T12:52:43Z">
+  <w:comment w:id="22" w:author="Revisión de coherencia" w:initials="RC" w:date="2026-09-30T22:28:07Z">
     <w:p>
       <w:pPr>
         <w:pStyle w:val="CommentText"/>
@@ -2974,7 +2974,7 @@
         <w:t xml:space="preserve">Contradice a: </w:t>
       </w:r>
       <w:r>
-        <w:t>Cap. VII, 2.5 y 2.8 (RESULTADOS): el ahorro temporal «debe medirse»; «requiere reconstruir la cronología de cada expediente».</w:t>
+        <w:t>Cap. VI (no presenta la «reincidencia anulatoria»); Tablas 1 y 2 (anulación 21,7 % y 20,1 %); Cap. VI, que no presenta ningún dato de duración, y 1.3: el diseño no permite «afirmar una reducción general de la duración procesal»; la reducción de tiempos solo constituye un «indicio».</w:t>
       </w:r>
     </w:p>
     <w:p>
@@ -2992,7 +2992,7 @@
       </w:r>
     </w:p>
   </w:comment>
-  <w:comment w:id="23" w:author="Revisión de coherencia" w:initials="RC" w:date="2026-09-29T12:52:43Z">
+  <w:comment w:id="23" w:author="Revisión de coherencia" w:initials="RC" w:date="2026-09-30T22:28:07Z">
     <w:p>
       <w:pPr>
         <w:pStyle w:val="CommentText"/>
@@ -3035,7 +3035,7 @@
         <w:t xml:space="preserve">Contradice a: </w:t>
       </w:r>
       <w:r>
-        <w:t>Cap. VII, 2.5 (RESULTADOS): «La necesidad de una reforma legislativa exige identificar una insuficiencia normativa concreta»; «cualquier propuesta de reforma debe partir de una insuficiencia normativa comprobada».</w:t>
+        <w:t>DISCUSIÓN 5.2.2 y Aportes § 4 (la variable crítica es el protocolo, no la norma); el Cap. VI no mide la invocación de las R. A. ni una insuficiencia normativa.</w:t>
       </w:r>
     </w:p>
     <w:p>
@@ -3053,7 +3053,7 @@
       </w:r>
     </w:p>
   </w:comment>
-  <w:comment w:id="24" w:author="Revisión de coherencia" w:initials="RC" w:date="2026-09-29T12:52:43Z">
+  <w:comment w:id="24" w:author="Revisión de coherencia" w:initials="RC" w:date="2026-09-30T22:28:07Z">
     <w:p>
       <w:pPr>
         <w:pStyle w:val="CommentText"/>
@@ -3096,7 +3096,7 @@
         <w:t xml:space="preserve">Contradice a: </w:t>
       </w:r>
       <w:r>
-        <w:t>Cap. VII, 2.5 (RESULTADOS).</w:t>
+        <w:t>DISCUSIÓN 5.2.2 y Aportes § 4 (la variable crítica es el protocolo, no la norma).</w:t>
       </w:r>
     </w:p>
     <w:p>
@@ -3114,7 +3114,7 @@
       </w:r>
     </w:p>
   </w:comment>
-  <w:comment w:id="25" w:author="Revisión de coherencia" w:initials="RC" w:date="2026-09-29T12:52:43Z">
+  <w:comment w:id="25" w:author="Revisión de coherencia" w:initials="RC" w:date="2026-09-30T22:28:07Z">
     <w:p>
       <w:pPr>
         <w:pStyle w:val="CommentText"/>
@@ -3157,7 +3157,7 @@
         <w:t xml:space="preserve">Contradice a: </w:t>
       </w:r>
       <w:r>
-        <w:t>Cap. VII, 2.5 (RESULTADOS): «No permite concluir que la alzada carezca de cambios en su método de trabajo ni identificarla como principal origen de la demora».</w:t>
+        <w:t>Cap. VI, que no presenta ningún dato de duración, y 1.3: el diseño no permite «afirmar una reducción general de la duración procesal»; la reducción de tiempos solo constituye un «indicio».</w:t>
       </w:r>
     </w:p>
     <w:p>
@@ -3175,7 +3175,7 @@
       </w:r>
     </w:p>
   </w:comment>
-  <w:comment w:id="26" w:author="Revisión de coherencia" w:initials="RC" w:date="2026-09-29T12:52:43Z">
+  <w:comment w:id="26" w:author="Revisión de coherencia" w:initials="RC" w:date="2026-09-30T22:28:07Z">
     <w:p>
       <w:pPr>
         <w:pStyle w:val="CommentText"/>
@@ -3218,7 +3218,7 @@
         <w:t xml:space="preserve">Contradice a: </w:t>
       </w:r>
       <w:r>
-        <w:t>Cap. VI, 1.1 (no atribución causal).</w:t>
+        <w:t>Cap. VI, 1.1 (último párrafo: la comparación documental «no permite atribuir causalidad exclusiva a las resoluciones administrativas») y 1.3 (primer párrafo: «el diseño no permite atribuir exclusivamente al modelo estas diferencias»).</w:t>
       </w:r>
     </w:p>
     <w:p>
@@ -3236,7 +3236,7 @@
       </w:r>
     </w:p>
   </w:comment>
-  <w:comment w:id="27" w:author="Revisión de coherencia" w:initials="RC" w:date="2026-09-29T12:52:43Z">
+  <w:comment w:id="27" w:author="Revisión de coherencia" w:initials="RC" w:date="2026-09-30T22:28:07Z">
     <w:p>
       <w:pPr>
         <w:pStyle w:val="CommentText"/>
@@ -3279,7 +3279,7 @@
         <w:t xml:space="preserve">Contradice a: </w:t>
       </w:r>
       <w:r>
-        <w:t>Tabla 4 y Cap. VII, 2.4 (RESULTADOS): «no demostrar su superioridad».</w:t>
+        <w:t>Tabla 4 (4 + 1 = 5 expedientes) y Cap. VI, 1.3.</w:t>
       </w:r>
     </w:p>
     <w:p>
@@ -3297,7 +3297,7 @@
       </w:r>
     </w:p>
   </w:comment>
-  <w:comment w:id="28" w:author="Revisión de coherencia" w:initials="RC" w:date="2026-09-29T12:52:43Z">
+  <w:comment w:id="28" w:author="Revisión de coherencia" w:initials="RC" w:date="2026-09-30T22:28:07Z">
     <w:p>
       <w:pPr>
         <w:pStyle w:val="CommentText"/>
@@ -3340,7 +3340,7 @@
         <w:t xml:space="preserve">Contradice a: </w:t>
       </w:r>
       <w:r>
-        <w:t>Cap. VI, Tabla 3; Cap. VII, 2.8.</w:t>
+        <w:t>Cap. VI, Tabla 3 y párrafo posterior (grupos no equivalentes por vía; comparaciones descriptivas).</w:t>
       </w:r>
     </w:p>
     <w:p>
@@ -3358,7 +3358,7 @@
       </w:r>
     </w:p>
   </w:comment>
-  <w:comment w:id="29" w:author="Revisión de coherencia" w:initials="RC" w:date="2026-09-29T12:52:43Z">
+  <w:comment w:id="29" w:author="Revisión de coherencia" w:initials="RC" w:date="2026-09-30T22:28:07Z">
     <w:p>
       <w:pPr>
         <w:pStyle w:val="CommentText"/>
@@ -3387,7 +3387,7 @@
         <w:t xml:space="preserve">Problema: </w:t>
       </w:r>
       <w:r>
-        <w:t>La matriz de Denzin no tiene número en el Cap. VII.</w:t>
+        <w:t>La matriz de Denzin estaba en el Cap. VII del archivo RESULTADOS, que se eliminó; hoy no está en ningún documento.</w:t>
       </w:r>
     </w:p>
     <w:p>
@@ -3401,7 +3401,7 @@
         <w:t xml:space="preserve">Contradice a: </w:t>
       </w:r>
       <w:r>
-        <w:t>Archivo RESULTADOS, 2.9 (R-16).</w:t>
+        <w:t>Archivo RESULTADOS (solo Cap. VI) y archivo DISCUSIÓN (no contiene la matriz).</w:t>
       </w:r>
     </w:p>
     <w:p>
@@ -3415,11 +3415,11 @@
         <w:t xml:space="preserve">Cambiar por: </w:t>
       </w:r>
       <w:r>
-        <w:t>Usar el número que se asigne a la matriz (p. ej., Tabla 9).</w:t>
+        <w:t>Trasladar la matriz al final de la Discusión (Cap. VII) con número de tabla correlativo y actualizar esta remisión, o suprimir la mención.</w:t>
       </w:r>
     </w:p>
   </w:comment>
-  <w:comment w:id="30" w:author="Revisión de coherencia" w:initials="RC" w:date="2026-09-29T12:52:43Z">
+  <w:comment w:id="30" w:author="Revisión de coherencia" w:initials="RC" w:date="2026-09-30T22:28:07Z">
     <w:p>
       <w:pPr>
         <w:pStyle w:val="CommentText"/>
@@ -3480,7 +3480,7 @@
       </w:r>
     </w:p>
   </w:comment>
-  <w:comment w:id="31" w:author="Revisión de coherencia" w:initials="RC" w:date="2026-09-29T12:52:43Z">
+  <w:comment w:id="31" w:author="Revisión de coherencia" w:initials="RC" w:date="2026-09-30T22:28:07Z">
     <w:p>
       <w:pPr>
         <w:pStyle w:val="CommentText"/>
@@ -3523,7 +3523,7 @@
         <w:t xml:space="preserve">Contradice a: </w:t>
       </w:r>
       <w:r>
-        <w:t>Tabla 6; Cap. VII, 2.3.</w:t>
+        <w:t>Tabla 6 (d) 15,1 % → 28,8 %; omisión de valoración 3,8 % → 11,5 %).</w:t>
       </w:r>
     </w:p>
     <w:p>
@@ -3541,7 +3541,7 @@
       </w:r>
     </w:p>
   </w:comment>
-  <w:comment w:id="32" w:author="Revisión de coherencia" w:initials="RC" w:date="2026-09-29T12:52:43Z">
+  <w:comment w:id="32" w:author="Revisión de coherencia" w:initials="RC" w:date="2026-09-30T22:28:07Z">
     <w:p>
       <w:pPr>
         <w:pStyle w:val="CommentText"/>
@@ -3584,7 +3584,7 @@
         <w:t xml:space="preserve">Contradice a: </w:t>
       </w:r>
       <w:r>
-        <w:t>Cap. VII, 2.3 y 2.6 (RESULTADOS): «La concentración facilita su observación, pero no garantiza esa correspondencia».</w:t>
+        <w:t>Cap. VI (no mide concordancia ni trazabilidad) y Tabla 6 (el desplazamiento es hacia d).</w:t>
       </w:r>
     </w:p>
     <w:p>
@@ -3602,7 +3602,7 @@
       </w:r>
     </w:p>
   </w:comment>
-  <w:comment w:id="33" w:author="Revisión de coherencia" w:initials="RC" w:date="2026-09-29T12:52:43Z">
+  <w:comment w:id="33" w:author="Revisión de coherencia" w:initials="RC" w:date="2026-09-30T22:28:07Z">
     <w:p>
       <w:pPr>
         <w:pStyle w:val="CommentText"/>
@@ -3645,7 +3645,7 @@
         <w:t xml:space="preserve">Contradice a: </w:t>
       </w:r>
       <w:r>
-        <w:t>Tabla 4; Cap. VI, 1.1.</w:t>
+        <w:t>Tabla 4; Cap. VI, 1.1 (último párrafo: la comparación documental «no permite atribuir causalidad exclusiva a las resoluciones administrativas») y 1.3 (primer párrafo: «el diseño no permite atribuir exclusivamente al modelo estas diferencias»).</w:t>
       </w:r>
     </w:p>
     <w:p>
@@ -3663,7 +3663,7 @@
       </w:r>
     </w:p>
   </w:comment>
-  <w:comment w:id="34" w:author="Revisión de coherencia" w:initials="RC" w:date="2026-09-29T12:52:43Z">
+  <w:comment w:id="34" w:author="Revisión de coherencia" w:initials="RC" w:date="2026-09-30T22:28:07Z">
     <w:p>
       <w:pPr>
         <w:pStyle w:val="CommentText"/>
@@ -3706,7 +3706,7 @@
         <w:t xml:space="preserve">Contradice a: </w:t>
       </w:r>
       <w:r>
-        <w:t>Tabla 6; Cap. VII, 2.3 y 2.7.</w:t>
+        <w:t>Tabla 6 (n = 53 / 52).</w:t>
       </w:r>
     </w:p>
     <w:p>
@@ -3724,7 +3724,7 @@
       </w:r>
     </w:p>
   </w:comment>
-  <w:comment w:id="35" w:author="Revisión de coherencia" w:initials="RC" w:date="2026-09-29T12:52:43Z">
+  <w:comment w:id="35" w:author="Revisión de coherencia" w:initials="RC" w:date="2026-09-30T22:28:07Z">
     <w:p>
       <w:pPr>
         <w:pStyle w:val="CommentText"/>
@@ -3753,7 +3753,7 @@
         <w:t xml:space="preserve">Problema: </w:t>
       </w:r>
       <w:r>
-        <w:t>El primer tramo (34,5 % → 27,4 %; 65,5 % → 72,6 %; 12,8 % → 7,3 %; 21,7 % y 20,1 %) es correcto. Pero la lista de defectos incluye categorías no codificadas o sin variación y repite la Conclusión 2; la duración no figura en el Cap. VI; y «porque la reforma… no cambió el método de trabajo de las Salas» es una atribución causal que la Discusión rechaza. Falta además una conclusión sobre el objetivo general y la hipótesis.</w:t>
+        <w:t>El primer tramo (34,5 % → 27,4 %; 65,5 % → 72,6 %; 12,8 % → 7,3 %; 21,7 % y 20,1 %) es correcto: son las series 281/328. Pero la lista de defectos incluye categorías no codificadas o sin variación y repite la Conclusión 2; la duración no figura en el Cap. VI; y «porque la reforma… no cambió el método de trabajo de las Salas» es una atribución causal. Falta además una conclusión sobre el objetivo general y la hipótesis.</w:t>
       </w:r>
     </w:p>
     <w:p>
@@ -3767,7 +3767,7 @@
         <w:t xml:space="preserve">Contradice a: </w:t>
       </w:r>
       <w:r>
-        <w:t>Cap. VII, 2.5 y 2.7 (RESULTADOS).</w:t>
+        <w:t>Cap. VI, que no presenta ningún dato de duración, y 1.3: el diseño no permite «afirmar una reducción general de la duración procesal»; la reducción de tiempos solo constituye un «indicio».</w:t>
       </w:r>
     </w:p>
     <w:p>
@@ -3785,7 +3785,7 @@
       </w:r>
     </w:p>
   </w:comment>
-  <w:comment w:id="36" w:author="Revisión de coherencia" w:initials="RC" w:date="2026-09-29T12:52:43Z">
+  <w:comment w:id="36" w:author="Revisión de coherencia" w:initials="RC" w:date="2026-09-30T22:28:07Z">
     <w:p>
       <w:pPr>
         <w:pStyle w:val="CommentText"/>
@@ -3828,7 +3828,7 @@
         <w:t xml:space="preserve">Contradice a: </w:t>
       </w:r>
       <w:r>
-        <w:t>Cap. VII, 2.5 (RESULTADOS): «La frecuencia reducida de un registro no permite concluir que deba incorporarse una nueva disposición al Código Procesal Civil».</w:t>
+        <w:t>DISCUSIÓN 5.2.2 y Aportes § 4 (la variable crítica es el protocolo, no la norma); Cap. VI sin dato de insuficiencia normativa.</w:t>
       </w:r>
     </w:p>
     <w:p>
@@ -3846,7 +3846,7 @@
       </w:r>
     </w:p>
   </w:comment>
-  <w:comment w:id="37" w:author="Revisión de coherencia" w:initials="RC" w:date="2026-09-29T12:52:43Z">
+  <w:comment w:id="37" w:author="Revisión de coherencia" w:initials="RC" w:date="2026-09-30T22:28:07Z">
     <w:p>
       <w:pPr>
         <w:pStyle w:val="CommentText"/>
@@ -3907,7 +3907,7 @@
       </w:r>
     </w:p>
   </w:comment>
-  <w:comment w:id="38" w:author="Revisión de coherencia" w:initials="RC" w:date="2026-09-29T12:52:43Z">
+  <w:comment w:id="38" w:author="Revisión de coherencia" w:initials="RC" w:date="2026-09-30T22:28:07Z">
     <w:p>
       <w:pPr>
         <w:pStyle w:val="CommentText"/>
@@ -3950,7 +3950,7 @@
         <w:t xml:space="preserve">Contradice a: </w:t>
       </w:r>
       <w:r>
-        <w:t>Cap. VII, 2.5 (RESULTADOS): «No permite… identificarla como principal origen de la demora sin desagregar los tiempos del proceso».</w:t>
+        <w:t>Cap. VI, que no presenta ningún dato de duración, y 1.3: el diseño no permite «afirmar una reducción general de la duración procesal»; la reducción de tiempos solo constituye un «indicio».</w:t>
       </w:r>
     </w:p>
     <w:p>

</xml_diff>